<commit_message>
assets(slc): update Speaking and Listening Level 2 exemplar downloadable forms
</commit_message>
<xml_diff>
--- a/assets/downloads/Candidate_A_Constantin_Presentation_Cue_Cards.docx
+++ b/assets/downloads/Candidate_A_Constantin_Presentation_Cue_Cards.docx
@@ -21,7 +21,7 @@
         </w:rPr>
         <w:t>Pearson Edexcel Functional Skills English Level 2 • Task 1 Exemplar</w:t>
         <w:br/>
-        <w:t>Topic: Infection Prevention &amp; Control in Community Healthcare</w:t>
+        <w:t>Topic: Dealing with Difficult Customers in Retail and Customer Service</w:t>
       </w:r>
     </w:p>
     <w:p>
@@ -32,7 +32,7 @@
           <w:color w:val="0F172A"/>
           <w:sz w:val="22"/>
         </w:rPr>
-        <w:t>■ CARD 1: INTRODUCTION &amp; PURPOSE</w:t>
+        <w:t>■ CARD 1: INTRODUCTION &amp; ROADMAP</w:t>
         <w:br/>
       </w:r>
     </w:p>
@@ -45,7 +45,7 @@
           <w:rFonts w:ascii="Arial" w:hAnsi="Arial"/>
           <w:sz w:val="20"/>
         </w:rPr>
-        <w:t>• Welcome assessor &amp; audience (Abdul, Thomas, Amara).</w:t>
+        <w:t>• Thank Abdul, welcome Thomas and Amara.</w:t>
       </w:r>
     </w:p>
     <w:p>
@@ -57,7 +57,7 @@
           <w:rFonts w:ascii="Arial" w:hAnsi="Arial"/>
           <w:sz w:val="20"/>
         </w:rPr>
-        <w:t>• Define SICPs: Standard Infection Control Precautions.</w:t>
+        <w:t>• Topic: Handling angry customers and de-escalating tense situations.</w:t>
       </w:r>
     </w:p>
     <w:p>
@@ -69,7 +69,7 @@
           <w:rFonts w:ascii="Arial" w:hAnsi="Arial"/>
           <w:sz w:val="20"/>
         </w:rPr>
-        <w:t>• Core purpose: Patient dignity, clinical safety, reducing HCAIs.</w:t>
+        <w:t>• Why it matters: Daily challenge in retail and frontline jobs.</w:t>
       </w:r>
     </w:p>
     <w:p>
@@ -81,7 +81,7 @@
           <w:rFonts w:ascii="Arial" w:hAnsi="Arial"/>
           <w:sz w:val="20"/>
         </w:rPr>
-        <w:t>• Signpost structure: Problem -&gt; Audit Data -&gt; 2 Solutions -&gt; Measurable Impact.</w:t>
+        <w:t>• Roadmap: Why people get upset -&gt; 3 Golden Rules -&gt; Store Results.</w:t>
       </w:r>
     </w:p>
     <w:p>
@@ -92,7 +92,7 @@
           <w:color w:val="0F172A"/>
           <w:sz w:val="22"/>
         </w:rPr>
-        <w:t>■ CARD 2: THE PROBLEM &amp; UKHSA EVIDENCE</w:t>
+        <w:t>■ CARD 2: WHY CUSTOMERS GET UPSET</w:t>
         <w:br/>
       </w:r>
     </w:p>
@@ -105,7 +105,7 @@
           <w:rFonts w:ascii="Arial" w:hAnsi="Arial"/>
           <w:sz w:val="20"/>
         </w:rPr>
-        <w:t>• HCAI cost to NHS: £1bn+ annually, avoidable hospital bed days.</w:t>
+        <w:t>• Root causes: Long queues, faulty products, feeling ignored by staff.</w:t>
       </w:r>
     </w:p>
     <w:p>
@@ -117,7 +117,7 @@
           <w:rFonts w:ascii="Arial" w:hAnsi="Arial"/>
           <w:sz w:val="20"/>
         </w:rPr>
-        <w:t>• UKHSA 2024 Audit Data: 82% baseline hand hygiene adherence.</w:t>
+        <w:t>• Human insight: Most people don't start out wanting to argue.</w:t>
       </w:r>
     </w:p>
     <w:p>
@@ -129,19 +129,7 @@
           <w:rFonts w:ascii="Arial" w:hAnsi="Arial"/>
           <w:sz w:val="20"/>
         </w:rPr>
-        <w:t>• Winter crisis surge: Compliance drops to 64% due to cognitive fatigue &amp; rush.</w:t>
-      </w:r>
-    </w:p>
-    <w:p>
-      <w:pPr>
-        <w:ind w:left="360"/>
-      </w:pPr>
-      <w:r>
-        <w:rPr>
-          <w:rFonts w:ascii="Arial" w:hAnsi="Arial"/>
-          <w:sz w:val="20"/>
-        </w:rPr>
-        <w:t>• Key issue: Inaccessible dispensers located down long corridors.</w:t>
+        <w:t>• Survey fact: 70%+ of customers walk away due to rude staff, not price.</w:t>
       </w:r>
     </w:p>
     <w:p>
@@ -152,7 +140,7 @@
           <w:color w:val="0F172A"/>
           <w:sz w:val="22"/>
         </w:rPr>
-        <w:t>■ CARD 3: TWO-PRONGED INTERVENTION</w:t>
+        <w:t>■ CARD 3: THREE GOLDEN RULES</w:t>
         <w:br/>
       </w:r>
     </w:p>
@@ -165,7 +153,7 @@
           <w:rFonts w:ascii="Arial" w:hAnsi="Arial"/>
           <w:sz w:val="20"/>
         </w:rPr>
-        <w:t>• Intervention 1 (Physical): Point-of-care dispensers at bedside &amp; clip-on caddies (&lt;£10).</w:t>
+        <w:t>• Rule 1: Listen actively without interrupting.</w:t>
       </w:r>
     </w:p>
     <w:p>
@@ -177,7 +165,7 @@
           <w:rFonts w:ascii="Arial" w:hAnsi="Arial"/>
           <w:sz w:val="20"/>
         </w:rPr>
-        <w:t>• Intervention 2 (Cultural): Monthly peer champion audits (supportive coaching, not blame).</w:t>
+        <w:t>• Rule 2: Apologise for their frustration (shows empathy, not blame).</w:t>
       </w:r>
     </w:p>
     <w:p>
@@ -189,7 +177,7 @@
           <w:rFonts w:ascii="Arial" w:hAnsi="Arial"/>
           <w:sz w:val="20"/>
         </w:rPr>
-        <w:t>• Behavioural nudge: Immediate positive visual feedback.</w:t>
+        <w:t>• Rule 3: Offer a practical solution (quick replacement, refund, voucher).</w:t>
       </w:r>
     </w:p>
     <w:p>
@@ -213,7 +201,7 @@
           <w:rFonts w:ascii="Arial" w:hAnsi="Arial"/>
           <w:sz w:val="20"/>
         </w:rPr>
-        <w:t>• Measurable Outcomes: 14% compliance surge (up to 96%).</w:t>
+        <w:t>• Store results: Complaints dropped by 25% across 6 months.</w:t>
       </w:r>
     </w:p>
     <w:p>
@@ -225,7 +213,7 @@
           <w:rFonts w:ascii="Arial" w:hAnsi="Arial"/>
           <w:sz w:val="20"/>
         </w:rPr>
-        <w:t>• Incident drop: 33% reduction in clinical contamination incidents over 6 months.</w:t>
+        <w:t>• Staff impact: New team members feel confident and calm under pressure.</w:t>
       </w:r>
     </w:p>
     <w:p>
@@ -237,7 +225,7 @@
           <w:rFonts w:ascii="Arial" w:hAnsi="Arial"/>
           <w:sz w:val="20"/>
         </w:rPr>
-        <w:t>• Conclusion: Compliance is structural + cultural, not just policy writing.</w:t>
+        <w:t>• Conclusion: Staying calm and listening is the secret to great service.</w:t>
       </w:r>
     </w:p>
     <w:p>
@@ -249,7 +237,7 @@
           <w:rFonts w:ascii="Arial" w:hAnsi="Arial"/>
           <w:sz w:val="20"/>
         </w:rPr>
-        <w:t>• Open floor: Invite questions from Thomas, Amara, Abdul.</w:t>
+        <w:t>• Transition: Thank audience and invite questions from Thomas, Amara, Abdul.</w:t>
       </w:r>
     </w:p>
     <w:p>
@@ -273,7 +261,7 @@
           <w:rFonts w:ascii="Arial" w:hAnsi="Arial"/>
           <w:sz w:val="20"/>
         </w:rPr>
-        <w:t>• If asked on cost/space (Thomas): Point-of-care caddies cheaper than 1 HCAI treatment.</w:t>
+        <w:t>• If asked about abusive shouting (Thomas): Zero tolerance; stay calm, warn politely, call manager.</w:t>
       </w:r>
     </w:p>
     <w:p>
@@ -285,7 +273,7 @@
           <w:rFonts w:ascii="Arial" w:hAnsi="Arial"/>
           <w:sz w:val="20"/>
         </w:rPr>
-        <w:t>• If asked on domestic home visits (Amara): Disposable paper field trays &amp; antimicrobial rubs.</w:t>
+        <w:t>• If asked about returns with no receipt (Amara): No cash refund; offer replacement, voucher, or system lookup.</w:t>
       </w:r>
     </w:p>
     <w:sectPr>

</xml_diff>

<commit_message>
refactor(content): audit plain English across all worksheets, topic pages, and shop
- Replaced academic jargon and high-register discourse markers across topic pages (consequently -> as a result, furthermore -> in addition)
- Streamlined worksheet download tiles across 106 topic pages to subject-tailored plain English
- Removed all forbidden ESOL references site-wide, replacing with vocational & adult skills
- Polished SLC exemplar cue cards and assessment record sheets
- Retained strict Pearson Edexcel word count boundaries on all writing model solutions
</commit_message>
<xml_diff>
--- a/assets/downloads/Candidate_A_Constantin_Presentation_Cue_Cards.docx
+++ b/assets/downloads/Candidate_A_Constantin_Presentation_Cue_Cards.docx
@@ -237,7 +237,19 @@
           <w:rFonts w:ascii="Arial" w:hAnsi="Arial"/>
           <w:sz w:val="20"/>
         </w:rPr>
-        <w:t>• Transition: Thank audience and invite questions from Thomas, Amara, Abdul.</w:t>
+        <w:t>• Tutor Silence: Abdul remains silent; DO NOT wait for tutor to prompt.</w:t>
+      </w:r>
+    </w:p>
+    <w:p>
+      <w:pPr>
+        <w:ind w:left="360"/>
+      </w:pPr>
+      <w:r>
+        <w:rPr>
+          <w:rFonts w:ascii="Arial" w:hAnsi="Arial"/>
+          <w:sz w:val="20"/>
+        </w:rPr>
+        <w:t>• Independent Q&amp;A: Immediately thank audience and invite questions from Thomas and Amara.</w:t>
       </w:r>
     </w:p>
     <w:p>

</xml_diff>

<commit_message>
Rename tutor persona Abdul to Subi across website, worksheets, diagrams, and video models
</commit_message>
<xml_diff>
--- a/assets/downloads/Candidate_A_Constantin_Presentation_Cue_Cards.docx
+++ b/assets/downloads/Candidate_A_Constantin_Presentation_Cue_Cards.docx
@@ -45,7 +45,7 @@
           <w:rFonts w:ascii="Arial" w:hAnsi="Arial"/>
           <w:sz w:val="20"/>
         </w:rPr>
-        <w:t>• Thank Abdul, welcome Thomas and Amara.</w:t>
+        <w:t>• Thank Subi, welcome Thomas and Amara.</w:t>
       </w:r>
     </w:p>
     <w:p>
@@ -237,7 +237,7 @@
           <w:rFonts w:ascii="Arial" w:hAnsi="Arial"/>
           <w:sz w:val="20"/>
         </w:rPr>
-        <w:t>• Tutor Silence: Abdul remains silent; DO NOT wait for tutor to prompt.</w:t>
+        <w:t>• Tutor Silence: Subi remains silent; DO NOT wait for tutor to prompt.</w:t>
       </w:r>
     </w:p>
     <w:p>

</xml_diff>